<commit_message>
AL-202 update ibrahima's AL-195 test case and AL-194 use case now that #62 is merged
</commit_message>
<xml_diff>
--- a/docs/sprint-1-submission/ibrahima/AL-195/test-case.docx
+++ b/docs/sprint-1-submission/ibrahima/AL-195/test-case.docx
@@ -233,7 +233,7 @@
               <w:rPr>
                 <w:sz w:val="19"/>
               </w:rPr>
-              <w:t>al-mobile/ on PR #62 (mortgage-or-HELOC choice) and the local AL-207 branch (HELOC check form); none of it is on main yet, repository CS3-Agentic-Lender/agentic-lender</w:t>
+              <w:t>al-mobile/: the mortgage-or-HELOC choice on main (PR #62, merged 22 Oct); the HELOC check form on the local AL-207 branch, repository CS3-Agentic-Lender/agentic-lender</w:t>
             </w:r>
           </w:p>
         </w:tc>
@@ -339,7 +339,7 @@
         <w:pStyle w:val="ListBullet"/>
       </w:pPr>
       <w:r>
-        <w:t>Unit test results: 199 tests on the PR #62 branch (19 Oct), 0 failures; 18 tests for the HELOC form on the local AL-207 branch.</w:t>
+        <w:t>Unit test results: 292 tests on PR #62 just before it merged into main (22 Oct), 0 failures; 18 tests for the HELOC form on the local AL-207 branch.</w:t>
       </w:r>
     </w:p>
     <w:p>
@@ -527,7 +527,7 @@
               <w:rPr>
                 <w:sz w:val="19"/>
               </w:rPr>
-              <w:t>Automated (PR #62 branch): LoanTypeTests &gt; testChoiceCardsUseTheFigmaWording, testValuesMatchTheApplicationsSchema; AffordabilityViewModelTests &gt; testTheChosenLoanTypeIsCarriedIntoTheApplication; ApplicationValidatorTests &gt; testDraftBodyCarriesTheChosenLoanType. Simulator screenshot of the choice. Pass on the branch for mortgage. The HELOC card is hidden until its check can calculate (LoanTypeTests &gt; testOnlyMortgageIsOfferedUntilTheHELOCCheckExists).</w:t>
+              <w:t>Automated: LoanTypeTests &gt; testChoiceCardsUseTheFigmaWording, testValuesMatchTheApplicationsSchema; AffordabilityViewModelTests &gt; testTheChosenLoanTypeIsCarriedIntoTheApplication; ApplicationValidatorTests &gt; testDraftBodyCarriesTheChosenLoanType. Simulator screenshot of the choice. Pass (on main) for mortgage. The HELOC card is hidden until its check can calculate (LoanTypeTests &gt; testOnlyMortgageIsOfferedUntilTheHELOCCheckExists).</w:t>
             </w:r>
           </w:p>
         </w:tc>
@@ -823,7 +823,7 @@
         <w:pStyle w:val="ListBullet"/>
       </w:pPr>
       <w:r>
-        <w:t>Done in Sprint 1: the wireframes (AL-205) and the mortgage-or-HELOC choice (AL-206, PR #62, in review).</w:t>
+        <w:t>Done in Sprint 1: the wireframes (AL-205) and the mortgage-or-HELOC choice (AL-206, PR #62, merged 22 Oct).</w:t>
       </w:r>
     </w:p>
     <w:p>

</xml_diff>